<commit_message>
docs: artigo atualizado com a previsao implementada e indice de gestao
</commit_message>
<xml_diff>
--- a/docs/artigo/Jogae_Sports_Artigo_Certificacao.docx
+++ b/docs/artigo/Jogae_Sports_Artigo_Certificacao.docx
@@ -1287,7 +1287,7 @@
           <w:sz w:val="24"/>
           <w:szCs w:val="24"/>
         </w:rPr>
-        <w:t xml:space="preserve">Para os dados meteorológicos do módulo proposto, as fontes consideradas são serviços públicos e abertos de previsão, como o Instituto Nacional de Meteorologia (INMET), a Fundação Cearense de Meteorologia e Recursos Hídricos (FUNCEME) e a API aberta Open-Meteo. Esse módulo ainda não foi implementado na versão atual do sistema.</w:t>
+        <w:t xml:space="preserve">Para os dados meteorológicos do módulo climático, as fontes consideradas são serviços públicos e abertos de previsão, como o Instituto Nacional de Meteorologia (INMET), a Fundação Cearense de Meteorologia e Recursos Hídricos (FUNCEME) e a API aberta Open-Meteo. Na versão atual, a previsão foi implementada com a Open-Meteo, que não exige chave de acesso e fornece, por hora e para sete dias, temperatura, probabilidade de chuva, vento, índice UV e condição do céu. A API do Jogaê Sports consulta o serviço, guarda o resultado em cache por 30 minutos e a página de reserva o exibe para o dia escolhido, com um selo de atenção por horário (chuva acima de 40%, vento acima de 30 km/h ou UV a partir de 8). O local de consulta está fixo em Fortaleza e o recurso foi criado para esta pesquisa, sem cobertura ainda dos requisitos de quadra coberta (RF01), alerta específico (RF04) e política de chuva (RF05).</w:t>
       </w:r>
     </w:p>
     <w:p>
@@ -2353,7 +2353,7 @@
           <w:sz w:val="24"/>
           <w:szCs w:val="24"/>
         </w:rPr>
-        <w:t xml:space="preserve">Como trabalhos futuros, pretende-se implementar o módulo climático, aplicar o questionário a gestores e jogadores, medir o efeito da previsão sobre os cancelamentos e avaliar a inclusão de alertas e de dados de fontes regionais, como a FUNCEME.</w:t>
+        <w:t xml:space="preserve">Como trabalhos futuros, pretende-se evoluir o módulo climático (coordenadas por estabelecimento, indicação de quadra coberta, alertas e política de chuva), aplicar o questionário a gestores e jogadores, medir o efeito da previsão sobre os cancelamentos e avaliar a inclusão de alertas e de dados de fontes regionais, como a FUNCEME.</w:t>
       </w:r>
     </w:p>
     <w:p>

</xml_diff>

<commit_message>
docs: ADRs 0001-0003, captura da previsao e status dos requisitos do artigo
</commit_message>
<xml_diff>
--- a/docs/artigo/Jogae_Sports_Artigo_Certificacao.docx
+++ b/docs/artigo/Jogae_Sports_Artigo_Certificacao.docx
@@ -932,7 +932,7 @@
                 <w:sz w:val="20"/>
                 <w:szCs w:val="20"/>
               </w:rPr>
-              <w:t xml:space="preserve">O gestor informa se cada quadra é coberta ou descoberta.</w:t>
+              <w:t xml:space="preserve">O gestor informa se cada quadra é coberta ou descoberta. (Trabalho futuro)</w:t>
             </w:r>
           </w:p>
         </w:tc>
@@ -1005,7 +1005,7 @@
                 <w:sz w:val="20"/>
                 <w:szCs w:val="20"/>
               </w:rPr>
-              <w:t xml:space="preserve">O sistema consulta a previsão para a localização da quadra, na data e no horário escolhidos.</w:t>
+              <w:t xml:space="preserve">O sistema consulta a previsão para a localização da quadra, na data e no horário escolhidos. (Implementado; local fixo em Fortaleza)</w:t>
             </w:r>
           </w:p>
         </w:tc>
@@ -1078,7 +1078,7 @@
                 <w:sz w:val="20"/>
                 <w:szCs w:val="20"/>
               </w:rPr>
-              <w:t xml:space="preserve">A página de reserva exibe condição do tempo, probabilidade de chuva e temperatura.</w:t>
+              <w:t xml:space="preserve">A página de reserva exibe condição do tempo, probabilidade de chuva e temperatura. (Implementado)</w:t>
             </w:r>
           </w:p>
         </w:tc>
@@ -1151,7 +1151,7 @@
                 <w:sz w:val="20"/>
                 <w:szCs w:val="20"/>
               </w:rPr>
-              <w:t xml:space="preserve">Para quadras descobertas, o sistema exibe alerta de risco de chuva.</w:t>
+              <w:t xml:space="preserve">Para quadras descobertas, o sistema exibe alerta de risco de chuva. (Trabalho futuro)</w:t>
             </w:r>
           </w:p>
         </w:tc>
@@ -1224,7 +1224,7 @@
                 <w:sz w:val="20"/>
                 <w:szCs w:val="20"/>
               </w:rPr>
-              <w:t xml:space="preserve">O gestor define a política de chuva (remarcação ou crédito) aplicada às reservas.</w:t>
+              <w:t xml:space="preserve">O gestor define a política de chuva (remarcação ou crédito) aplicada às reservas. (Trabalho futuro)</w:t>
             </w:r>
           </w:p>
         </w:tc>

</xml_diff>

<commit_message>
docs: deixa claro que front e lojinha estao em validacao
</commit_message>
<xml_diff>
--- a/docs/artigo/Jogae_Sports_Artigo_Certificacao.docx
+++ b/docs/artigo/Jogae_Sports_Artigo_Certificacao.docx
@@ -1287,7 +1287,7 @@
           <w:sz w:val="24"/>
           <w:szCs w:val="24"/>
         </w:rPr>
-        <w:t xml:space="preserve">Para os dados meteorológicos do módulo climático, as fontes consideradas são serviços públicos e abertos de previsão, como o Instituto Nacional de Meteorologia (INMET), a Fundação Cearense de Meteorologia e Recursos Hídricos (FUNCEME) e a API aberta Open-Meteo. Na versão atual, a previsão foi implementada com a Open-Meteo, que não exige chave de acesso e fornece, por hora e para sete dias, temperatura, probabilidade de chuva, vento, índice UV e condição do céu. A API do Jogaê Sports consulta o serviço, guarda o resultado em cache por 30 minutos e a página de reserva o exibe para o dia escolhido, com um selo de atenção por horário (chuva acima de 40%, vento acima de 30 km/h ou UV a partir de 8). O local de consulta está fixo em Fortaleza e o recurso foi criado para esta pesquisa, sem cobertura ainda dos requisitos de quadra coberta (RF01), alerta específico (RF04) e política de chuva (RF05).</w:t>
+        <w:t xml:space="preserve">Para os dados meteorológicos do módulo climático, as fontes consideradas são serviços públicos e abertos de previsão, como o Instituto Nacional de Meteorologia (INMET), a Fundação Cearense de Meteorologia e Recursos Hídricos (FUNCEME) e a API aberta Open-Meteo. Na versão atual, a previsão foi implementada com a Open-Meteo, que não exige chave de acesso e fornece, por hora e para sete dias, temperatura, probabilidade de chuva, vento, índice UV e condição do céu. A API do Jogaê Sports consulta o serviço, guarda o resultado em cache por 30 minutos e a página de reserva o exibe para o dia escolhido, com um selo de atenção por horário (chuva acima de 40%, vento acima de 30 km/h ou UV a partir de 8). O local de consulta está fixo em Fortaleza e o recurso foi criado para esta pesquisa, sem cobertura ainda dos requisitos de quadra coberta (RF01), alerta específico (RF04) e política de chuva (RF05). O front-end e a aba da lojinha (página pública de reserva) ainda estão em processo de validação, e a aparência das telas pode mudar conforme as atualizações; o processo de reserva com previsão, em tese, permanece o mesmo.</w:t>
       </w:r>
     </w:p>
     <w:p>
@@ -2293,7 +2293,7 @@
           <w:sz w:val="24"/>
           <w:szCs w:val="24"/>
         </w:rPr>
-        <w:t xml:space="preserve">Como limitação, o Jogaê Sports ainda não foi avaliado com usuários. Os estudos revisados tratam de clima e atividade física em geral, e não de decisões de reserva, de modo que o efeito da previsão sobre cancelamentos e satisfação precisa ser verificado na validação planejada na Seção 3.3.</w:t>
+        <w:t xml:space="preserve">Como limitação, o Jogaê Sports ainda não foi avaliado com usuários, e o front-end e a lojinha seguem em validação, de modo que a visualização apresentada pode mudar com as atualizações, embora o fluxo de reserva deva se manter. Os estudos revisados tratam de clima e atividade física em geral, e não de decisões de reserva, de modo que o efeito da previsão sobre cancelamentos e satisfação precisa ser verificado na validação planejada na Seção 3.3.</w:t>
       </w:r>
     </w:p>
     <w:p>

</xml_diff>